<commit_message>
Release v1.1.0 internal schedule workspace
</commit_message>
<xml_diff>
--- a/云屿摄影小程序安装使用手册.docx
+++ b/云屿摄影小程序安装使用手册.docx
@@ -3276,151 +3276,7 @@
         </w:rPr>
       </w:pPr>
       <w:r>
-        <w:rPr>
-          <w:rFonts w:ascii="微软雅黑" w:eastAsia="微软雅黑" w:hAnsi="微软雅黑"/>
-          <w:shd w:val="pct15" w:color="auto" w:fill="FFFFFF"/>
-        </w:rPr>
-        <w:t>系统初次</w:t>
-      </w:r>
-      <w:r>
-        <w:rPr>
-          <w:rFonts w:ascii="微软雅黑" w:eastAsia="微软雅黑" w:hAnsi="微软雅黑"/>
-          <w:shd w:val="pct15" w:color="auto" w:fill="FFFFFF"/>
-        </w:rPr>
-        <w:t>搭建完毕</w:t>
-      </w:r>
-      <w:r>
-        <w:rPr>
-          <w:rFonts w:ascii="微软雅黑" w:eastAsia="微软雅黑" w:hAnsi="微软雅黑"/>
-          <w:shd w:val="pct15" w:color="auto" w:fill="FFFFFF"/>
-        </w:rPr>
-        <w:t>之后</w:t>
-      </w:r>
-      <w:r>
-        <w:rPr>
-          <w:rFonts w:ascii="微软雅黑" w:eastAsia="微软雅黑" w:hAnsi="微软雅黑" w:hint="eastAsia"/>
-          <w:shd w:val="pct15" w:color="auto" w:fill="FFFFFF"/>
-        </w:rPr>
-        <w:t>，</w:t>
-      </w:r>
-      <w:r>
-        <w:rPr>
-          <w:rFonts w:ascii="微软雅黑" w:eastAsia="微软雅黑" w:hAnsi="微软雅黑"/>
-          <w:shd w:val="pct15" w:color="auto" w:fill="FFFFFF"/>
-        </w:rPr>
-        <w:t>有一个</w:t>
-      </w:r>
-      <w:r>
-        <w:rPr>
-          <w:rFonts w:ascii="微软雅黑" w:eastAsia="微软雅黑" w:hAnsi="微软雅黑"/>
-          <w:shd w:val="pct15" w:color="auto" w:fill="FFFFFF"/>
-        </w:rPr>
-        <w:t>默认</w:t>
-      </w:r>
-      <w:r>
-        <w:rPr>
-          <w:rFonts w:ascii="微软雅黑" w:eastAsia="微软雅黑" w:hAnsi="微软雅黑"/>
-          <w:shd w:val="pct15" w:color="auto" w:fill="FFFFFF"/>
-        </w:rPr>
-        <w:t>超级管理</w:t>
-      </w:r>
-      <w:r>
-        <w:rPr>
-          <w:rFonts w:ascii="微软雅黑" w:eastAsia="微软雅黑" w:hAnsi="微软雅黑"/>
-          <w:shd w:val="pct15" w:color="auto" w:fill="FFFFFF"/>
-        </w:rPr>
-        <w:t>员</w:t>
-      </w:r>
-      <w:r>
-        <w:rPr>
-          <w:rFonts w:ascii="微软雅黑" w:eastAsia="微软雅黑" w:hAnsi="微软雅黑" w:hint="eastAsia"/>
-          <w:shd w:val="pct15" w:color="auto" w:fill="FFFFFF"/>
-        </w:rPr>
-        <w:t>，</w:t>
-      </w:r>
-      <w:r>
-        <w:rPr>
-          <w:rFonts w:ascii="微软雅黑" w:eastAsia="微软雅黑" w:hAnsi="微软雅黑"/>
-          <w:shd w:val="pct15" w:color="auto" w:fill="FFFFFF"/>
-        </w:rPr>
-        <w:t>用户名为</w:t>
-      </w:r>
-      <w:r>
-        <w:rPr>
-          <w:rFonts w:ascii="微软雅黑" w:eastAsia="微软雅黑" w:hAnsi="微软雅黑" w:hint="eastAsia"/>
-          <w:shd w:val="pct15" w:color="auto" w:fill="FFFFFF"/>
-        </w:rPr>
-        <w:t>：</w:t>
-      </w:r>
-      <w:r>
-        <w:rPr>
-          <w:rFonts w:ascii="微软雅黑" w:eastAsia="微软雅黑" w:hAnsi="微软雅黑" w:hint="eastAsia"/>
-          <w:shd w:val="pct15" w:color="auto" w:fill="FFFFFF"/>
-        </w:rPr>
-        <w:t>a</w:t>
-      </w:r>
-      <w:r>
-        <w:rPr>
-          <w:rFonts w:ascii="微软雅黑" w:eastAsia="微软雅黑" w:hAnsi="微软雅黑"/>
-          <w:shd w:val="pct15" w:color="auto" w:fill="FFFFFF"/>
-        </w:rPr>
-        <w:t>dmin</w:t>
-      </w:r>
-      <w:r>
-        <w:rPr>
-          <w:rFonts w:ascii="微软雅黑" w:eastAsia="微软雅黑" w:hAnsi="微软雅黑" w:hint="eastAsia"/>
-          <w:shd w:val="pct15" w:color="auto" w:fill="FFFFFF"/>
-        </w:rPr>
-        <w:t>，</w:t>
-      </w:r>
-      <w:r>
-        <w:rPr>
-          <w:rFonts w:ascii="微软雅黑" w:eastAsia="微软雅黑" w:hAnsi="微软雅黑"/>
-          <w:shd w:val="pct15" w:color="auto" w:fill="FFFFFF"/>
-        </w:rPr>
-        <w:t>密码为</w:t>
-      </w:r>
-      <w:r>
-        <w:rPr>
-          <w:rFonts w:ascii="微软雅黑" w:eastAsia="微软雅黑" w:hAnsi="微软雅黑" w:hint="eastAsia"/>
-          <w:shd w:val="pct15" w:color="auto" w:fill="FFFFFF"/>
-        </w:rPr>
-        <w:t>：</w:t>
-      </w:r>
-      <w:r>
-        <w:rPr>
-          <w:rFonts w:ascii="微软雅黑" w:eastAsia="微软雅黑" w:hAnsi="微软雅黑" w:hint="eastAsia"/>
-          <w:shd w:val="pct15" w:color="auto" w:fill="FFFFFF"/>
-        </w:rPr>
-        <w:t>1</w:t>
-      </w:r>
-      <w:r>
-        <w:rPr>
-          <w:rFonts w:ascii="微软雅黑" w:eastAsia="微软雅黑" w:hAnsi="微软雅黑"/>
-          <w:shd w:val="pct15" w:color="auto" w:fill="FFFFFF"/>
-        </w:rPr>
-        <w:t>23456</w:t>
-      </w:r>
-      <w:r>
-        <w:rPr>
-          <w:rFonts w:ascii="微软雅黑" w:eastAsia="微软雅黑" w:hAnsi="微软雅黑" w:hint="eastAsia"/>
-          <w:shd w:val="pct15" w:color="auto" w:fill="FFFFFF"/>
-        </w:rPr>
-        <w:t>， 请</w:t>
-      </w:r>
-      <w:r>
-        <w:rPr>
-          <w:rFonts w:ascii="微软雅黑" w:eastAsia="微软雅黑" w:hAnsi="微软雅黑" w:hint="eastAsia"/>
-          <w:shd w:val="pct15" w:color="auto" w:fill="FFFFFF"/>
-        </w:rPr>
-        <w:t>及时</w:t>
-      </w:r>
-      <w:r>
-        <w:rPr>
-          <w:rFonts w:ascii="微软雅黑" w:eastAsia="微软雅黑" w:hAnsi="微软雅黑" w:hint="eastAsia"/>
-          <w:shd w:val="pct15" w:color="auto" w:fill="FFFFFF"/>
-        </w:rPr>
-        <w:t>登录管理后台修改密码和新增其他普通管理员。</w:t>
+        <w:t>系统初次搭建前，请先在云函数 mcloud 的环境变量中配置 B00_ADMIN_INIT_PASSWORD（或 ADMIN_INIT_PASSWORD）作为 admin 初始强密码；首次初始化后会自动创建超级管理员 admin。请通过安全渠道保存该密码，并按员工职责新增普通管理员。</w:t>
       </w:r>
     </w:p>
     <w:p>

</xml_diff>